<commit_message>
updated docx with challenges and further information
</commit_message>
<xml_diff>
--- a/Sirma_Academy_Gamification_BRD 1.docx
+++ b/Sirma_Academy_Gamification_BRD 1.docx
@@ -319,7 +319,7 @@
           <w:sz w:val="26"/>
           <w:szCs w:val="26"/>
         </w:rPr>
-        <w:t>Data &amp; Integration Approach (Non-Invasive Extension)</w:t>
+        <w:t>Class System &amp; Simulated Challenges (Concept Extension)</w:t>
       </w:r>
     </w:p>
     <w:p>
@@ -340,17 +340,8 @@
           <w:rFonts w:asciiTheme="minorHAnsi" w:hAnsiTheme="minorHAnsi" w:cstheme="minorHAnsi"/>
           <w:sz w:val="26"/>
           <w:szCs w:val="26"/>
-          <w:lang w:val="en-US"/>
         </w:rPr>
-        <w:t xml:space="preserve">Risks </w:t>
-      </w:r>
-      <w:r>
-        <w:rPr>
-          <w:rFonts w:asciiTheme="minorHAnsi" w:hAnsiTheme="minorHAnsi" w:cstheme="minorHAnsi"/>
-          <w:sz w:val="26"/>
-          <w:szCs w:val="26"/>
-        </w:rPr>
-        <w:t>&amp; Mitigations</w:t>
+        <w:t>Data &amp; Integration Approach (Non-Invasive Extension)</w:t>
       </w:r>
     </w:p>
     <w:p>
@@ -373,7 +364,7 @@
           <w:szCs w:val="26"/>
           <w:lang w:val="en-US"/>
         </w:rPr>
-        <w:t xml:space="preserve">Phased </w:t>
+        <w:t xml:space="preserve">Risks </w:t>
       </w:r>
       <w:r>
         <w:rPr>
@@ -381,7 +372,7 @@
           <w:sz w:val="26"/>
           <w:szCs w:val="26"/>
         </w:rPr>
-        <w:t>Rollout Plan</w:t>
+        <w:t>&amp; Mitigations</w:t>
       </w:r>
     </w:p>
     <w:p>
@@ -402,6 +393,37 @@
           <w:rFonts w:asciiTheme="minorHAnsi" w:hAnsiTheme="minorHAnsi" w:cstheme="minorHAnsi"/>
           <w:sz w:val="26"/>
           <w:szCs w:val="26"/>
+          <w:lang w:val="en-US"/>
+        </w:rPr>
+        <w:t xml:space="preserve">Phased </w:t>
+      </w:r>
+      <w:r>
+        <w:rPr>
+          <w:rFonts w:asciiTheme="minorHAnsi" w:hAnsiTheme="minorHAnsi" w:cstheme="minorHAnsi"/>
+          <w:sz w:val="26"/>
+          <w:szCs w:val="26"/>
+        </w:rPr>
+        <w:t>Rollout Plan</w:t>
+      </w:r>
+    </w:p>
+    <w:p>
+      <w:pPr>
+        <w:pStyle w:val="NormalWeb"/>
+        <w:numPr>
+          <w:ilvl w:val="0"/>
+          <w:numId w:val="3"/>
+        </w:numPr>
+        <w:rPr>
+          <w:rFonts w:asciiTheme="minorHAnsi" w:hAnsiTheme="minorHAnsi" w:cstheme="minorHAnsi"/>
+          <w:sz w:val="26"/>
+          <w:szCs w:val="26"/>
+        </w:rPr>
+      </w:pPr>
+      <w:r>
+        <w:rPr>
+          <w:rFonts w:asciiTheme="minorHAnsi" w:hAnsiTheme="minorHAnsi" w:cstheme="minorHAnsi"/>
+          <w:sz w:val="26"/>
+          <w:szCs w:val="26"/>
         </w:rPr>
         <w:t>Acceptance Criteria (Given / When / Then)</w:t>
       </w:r>
@@ -434,83 +456,9 @@
         <w:spacing w:after="160" w:line="276" w:lineRule="auto"/>
       </w:pPr>
       <w:r>
-        <w:t xml:space="preserve">This document proposes a </w:t>
-      </w:r>
-      <w:r>
-        <w:t>“</w:t>
-      </w:r>
-      <w:r>
-        <w:t>gamification</w:t>
-      </w:r>
-      <w:r>
-        <w:t>”</w:t>
-      </w:r>
-      <w:r>
-        <w:t xml:space="preserve"> layer — points, badges, ranks, streaks, and leaderboards — built on top of existing enrolment, completion, certificate and program data. The design requires no change to the source files (User, Course, CourseInstance, Program, Seminar, SeminarInstance, Certificate); it is an additive extension that reads existing fields and writes to new, purpose-built collections. The feature set is derived using Bartle's player-type taxonomy (Achievers, Explorers, Socializers, Killers) so the mechanics motivate the whole learner base, not only the competitive minority, in service of a measurable goal: higher completion rates and stronger learner retention.</w:t>
-      </w:r>
-    </w:p>
-    <w:tbl>
-      <w:tblPr>
-        <w:tblW w:w="5000" w:type="pct"/>
-        <w:tblBorders>
-          <w:top w:val="single" w:sz="6" w:space="0" w:color="B08D57"/>
-          <w:left w:val="single" w:sz="6" w:space="0" w:color="B08D57"/>
-          <w:bottom w:val="single" w:sz="6" w:space="0" w:color="B08D57"/>
-          <w:right w:val="single" w:sz="6" w:space="0" w:color="B08D57"/>
-          <w:insideH w:val="none" w:sz="0" w:space="0" w:color="FFFFFF"/>
-          <w:insideV w:val="none" w:sz="0" w:space="0" w:color="FFFFFF"/>
-        </w:tblBorders>
-        <w:tblCellMar>
-          <w:left w:w="10" w:type="dxa"/>
-          <w:right w:w="10" w:type="dxa"/>
-        </w:tblCellMar>
-        <w:tblLook w:val="04A0" w:firstRow="1" w:lastRow="0" w:firstColumn="1" w:lastColumn="0" w:noHBand="0" w:noVBand="1"/>
-      </w:tblPr>
-      <w:tblGrid>
-        <w:gridCol w:w="9730"/>
-      </w:tblGrid>
-      <w:tr>
-        <w:tc>
-          <w:tcPr>
-            <w:tcW w:w="0" w:type="auto"/>
-            <w:shd w:val="clear" w:color="auto" w:fill="F2F0EB"/>
-            <w:tcMar>
-              <w:top w:w="150" w:type="dxa"/>
-              <w:left w:w="200" w:type="dxa"/>
-              <w:bottom w:w="150" w:type="dxa"/>
-              <w:right w:w="200" w:type="dxa"/>
-            </w:tcMar>
-          </w:tcPr>
-          <w:p>
-            <w:pPr>
-              <w:spacing w:after="60"/>
-            </w:pPr>
-            <w:r>
-              <w:rPr>
-                <w:b/>
-                <w:bCs/>
-                <w:color w:val="1F2A44"/>
-                <w:sz w:val="20"/>
-                <w:szCs w:val="20"/>
-              </w:rPr>
-              <w:t>Bottom line for the business</w:t>
-            </w:r>
-          </w:p>
-          <w:p>
-            <w:r>
-              <w:rPr>
-                <w:i/>
-                <w:iCs/>
-                <w:color w:val="5B5B5B"/>
-                <w:sz w:val="20"/>
-                <w:szCs w:val="20"/>
-              </w:rPr>
-              <w:t>Gamification is proposed not as a cosmetic add-on but as a retention lever attached directly to the two metrics the Academy is measured on: how many learners finish what they start, and how many come back for the next course.</w:t>
-            </w:r>
-          </w:p>
-        </w:tc>
-      </w:tr>
-    </w:tbl>
+        <w:t>This document proposes a “gamification” layer — points, badges, ranks, streaks, and leaderboards — built on top of existing enrolment, completion, certificate and program data. The design requires no change to the source files (User, Course, CourseInstance, Program, Seminar, SeminarInstance, Certificate); it is an additive extension that reads existing fields and writes to new, purpose-built collections. The feature set is derived using Bartle's player-type taxonomy (Achievers, Explorers, Socializers, Killers) so the mechanics motivate the whole learner base, not only the competitive minority, in service of a measurable goal: higher completion rates and stronger learner retention.</w:t>
+      </w:r>
+    </w:p>
     <w:p>
       <w:pPr>
         <w:pStyle w:val="heading10"/>
@@ -538,13 +486,7 @@
         <w:spacing w:after="80"/>
       </w:pPr>
       <w:r>
-        <w:t>A User enro</w:t>
-      </w:r>
-      <w:r>
-        <w:t>l</w:t>
-      </w:r>
-      <w:r>
-        <w:t>ls in CourseInstances, SeminarInstances, Assessments and Programs (enrolledCourseInstances, enrolledSeminarInstances, enrolledPrograms).</w:t>
+        <w:t>A User enrolls in CourseInstances, SeminarInstances, Assessments and Programs (enrolledCourseInstances, enrolledSeminarInstances, enrolledPrograms).</w:t>
       </w:r>
     </w:p>
     <w:p>
@@ -716,7 +658,6 @@
                 <w:sz w:val="19"/>
                 <w:szCs w:val="19"/>
               </w:rPr>
-              <w:lastRenderedPageBreak/>
               <w:t>ID</w:t>
             </w:r>
           </w:p>
@@ -811,21 +752,7 @@
                 <w:sz w:val="19"/>
                 <w:szCs w:val="19"/>
               </w:rPr>
-              <w:t>Increase the completion rate of enrolled Course</w:t>
-            </w:r>
-            <w:r>
-              <w:rPr>
-                <w:sz w:val="19"/>
-                <w:szCs w:val="19"/>
-              </w:rPr>
-              <w:t xml:space="preserve"> </w:t>
-            </w:r>
-            <w:r>
-              <w:rPr>
-                <w:sz w:val="19"/>
-                <w:szCs w:val="19"/>
-              </w:rPr>
-              <w:t>Instances (fewer abandoned enrolments)</w:t>
+              <w:t>Increase the completion rate of enrolled Course Instances (fewer abandoned enrolments)</w:t>
             </w:r>
           </w:p>
         </w:tc>
@@ -937,6 +864,7 @@
                 <w:sz w:val="19"/>
                 <w:szCs w:val="19"/>
               </w:rPr>
+              <w:lastRenderedPageBreak/>
               <w:t>O3</w:t>
             </w:r>
           </w:p>
@@ -1353,14 +1281,7 @@
                 <w:sz w:val="19"/>
                 <w:szCs w:val="19"/>
               </w:rPr>
-              <w:t>Program.enrolledUsers vs. Program.completedByUsers</w:t>
-            </w:r>
-            <w:r>
-              <w:rPr>
-                <w:sz w:val="19"/>
-                <w:szCs w:val="19"/>
-              </w:rPr>
-              <w:t>(Program.js)</w:t>
+              <w:t>Program.enrolledUsers vs. Program.completedByUsers(Program.js)</w:t>
             </w:r>
           </w:p>
         </w:tc>
@@ -1426,14 +1347,7 @@
                 <w:sz w:val="19"/>
                 <w:szCs w:val="19"/>
               </w:rPr>
-              <w:t>curriculum[].lessons[].completedBy timestamps</w:t>
-            </w:r>
-            <w:r>
-              <w:rPr>
-                <w:sz w:val="19"/>
-                <w:szCs w:val="19"/>
-              </w:rPr>
-              <w:t xml:space="preserve"> (CourseInstance.js)</w:t>
+              <w:t>curriculum[].lessons[].completedBy timestamps (CourseInstance.js)</w:t>
             </w:r>
           </w:p>
         </w:tc>
@@ -1500,7 +1414,7 @@
                 <w:sz w:val="19"/>
                 <w:szCs w:val="19"/>
               </w:rPr>
-              <w:t>New: PointsLedger / activity log (Section 9)</w:t>
+              <w:t>New: PointsLedger / activity log (Section 8)</w:t>
             </w:r>
           </w:p>
         </w:tc>
@@ -1566,14 +1480,7 @@
                 <w:sz w:val="19"/>
                 <w:szCs w:val="19"/>
               </w:rPr>
-              <w:t>Certificate.score</w:t>
-            </w:r>
-            <w:r>
-              <w:rPr>
-                <w:sz w:val="19"/>
-                <w:szCs w:val="19"/>
-              </w:rPr>
-              <w:t xml:space="preserve"> (Certificate.js)</w:t>
+              <w:t>Certificate.score (Certificate.js)</w:t>
             </w:r>
           </w:p>
         </w:tc>
@@ -1736,19 +1643,10 @@
     <w:p>
       <w:pPr>
         <w:pStyle w:val="heading10"/>
-        <w:spacing w:before="400"/>
-      </w:pPr>
-    </w:p>
-    <w:p>
-      <w:pPr>
-        <w:pStyle w:val="heading10"/>
         <w:spacing w:before="400" w:after="150"/>
       </w:pPr>
       <w:r>
-        <w:t>5</w:t>
-      </w:r>
-      <w:r>
-        <w:t>. Scope</w:t>
+        <w:t>5. Scope</w:t>
       </w:r>
     </w:p>
     <w:p>
@@ -1774,7 +1672,7 @@
         <w:spacing w:after="80"/>
       </w:pPr>
       <w:r>
-        <w:t>Badge catalogue and award engine (Section 10).</w:t>
+        <w:t>Badge catalogue and award engine (Section 9).</w:t>
       </w:r>
     </w:p>
     <w:p>
@@ -1787,7 +1685,7 @@
         <w:spacing w:after="80"/>
       </w:pPr>
       <w:r>
-        <w:t>Ranks / levels derived from accumulated points (Section 11).</w:t>
+        <w:t>Ranks / levels derived from accumulated points (Section 10).</w:t>
       </w:r>
     </w:p>
     <w:p>
@@ -1813,7 +1711,7 @@
         <w:spacing w:after="80"/>
       </w:pPr>
       <w:r>
-        <w:t>Leaderboards, respecting the existing User.private flag as an opt-out (Section 12).</w:t>
+        <w:t>Leaderboards, respecting the existing User.private flag as an opt-out (Section 8, FR-5).</w:t>
       </w:r>
     </w:p>
     <w:p>
@@ -1831,23 +1729,36 @@
     </w:p>
     <w:p>
       <w:pPr>
+        <w:pStyle w:val="ListParagraph"/>
+        <w:numPr>
+          <w:ilvl w:val="0"/>
+          <w:numId w:val="2"/>
+        </w:numPr>
+        <w:spacing w:after="80"/>
+      </w:pPr>
+      <w:r>
+        <w:t>Learner classes and simulated peer challenges (Section 11) — a proposed concept, tracked as a Phase 4 / backlog item (Section 14), not committed for the initial three phases.</w:t>
+      </w:r>
+    </w:p>
+    <w:p>
+      <w:pPr>
         <w:pStyle w:val="heading10"/>
         <w:spacing w:before="400"/>
       </w:pPr>
       <w:r>
+        <w:t>6. User Research: Designing for Player Motivation (Bartle's Taxonomy)</w:t>
+      </w:r>
+    </w:p>
+    <w:p>
+      <w:pPr>
+        <w:spacing w:after="160" w:line="276" w:lineRule="auto"/>
+      </w:pPr>
+      <w:r>
+        <w:t xml:space="preserve">A gamification layer that only rewards the top of a leaderboard motivates a small, already-competitive slice of learners and discourages everyone else. To design mechanics that lift completion and retention across the whole </w:t>
+      </w:r>
+      <w:r>
         <w:lastRenderedPageBreak/>
-        <w:t>6</w:t>
-      </w:r>
-      <w:r>
-        <w:t>. User Research: Designing for Player Motivation (Bartle's Taxonomy)</w:t>
-      </w:r>
-    </w:p>
-    <w:p>
-      <w:pPr>
-        <w:spacing w:after="160" w:line="276" w:lineRule="auto"/>
-      </w:pPr>
-      <w:r>
-        <w:t>A gamification layer that only rewards the top of a leaderboard motivates a small, already-competitive slice of learners and discourages everyone else. To design mechanics that lift completion and retention across the whole learner base, this BRD uses Richard Bartle's player-type model, shown below, which groups player motivation into four archetypes along two axes: acting vs. interacting, and world-focused vs. player-focused. Each learner is a mix of all four, so the feature set is deliberately built to give every type at least one mechanic that speaks to them.</w:t>
+        <w:t>learner base, this BRD uses Richard Bartle's player-type model, shown below, which groups player motivation into four archetypes along two axes: acting vs. interacting, and world-focused vs. player-focused. Each learner is a mix of all four, so the feature set is deliberately built to give every type at least one mechanic that speaks to them.</w:t>
       </w:r>
     </w:p>
     <w:p>
@@ -2140,14 +2051,7 @@
                 <w:sz w:val="19"/>
                 <w:szCs w:val="19"/>
               </w:rPr>
-              <w:t xml:space="preserve">Points/XP, progress bars, completion badges, certificate-tier badges </w:t>
-            </w:r>
-            <w:r>
-              <w:rPr>
-                <w:sz w:val="19"/>
-                <w:szCs w:val="19"/>
-              </w:rPr>
-              <w:t>(Proficient, Advanced, Flawless)</w:t>
+              <w:t>Points/XP, progress bars, completion badges, certificate-tier badges (Proficient, Advanced, Flawless)</w:t>
             </w:r>
           </w:p>
         </w:tc>
@@ -2435,10 +2339,7 @@
         <w:spacing w:before="400"/>
       </w:pPr>
       <w:r>
-        <w:t>7</w:t>
-      </w:r>
-      <w:r>
-        <w:t>. Functional Requirements Overview</w:t>
+        <w:t>7. Functional Requirements Overview</w:t>
       </w:r>
     </w:p>
     <w:p>
@@ -2446,7 +2347,6 @@
         <w:spacing w:after="160" w:line="276" w:lineRule="auto"/>
       </w:pPr>
       <w:r>
-        <w:lastRenderedPageBreak/>
         <w:t>Each requirement is mapped to the existing schema field(s) that trigger it, so engineering can trace every mechanic back to a real, already-captured event — no new tracking has to be invented, only new reactions to existing writes.</w:t>
       </w:r>
     </w:p>
@@ -2500,6 +2400,7 @@
                 <w:sz w:val="19"/>
                 <w:szCs w:val="19"/>
               </w:rPr>
+              <w:lastRenderedPageBreak/>
               <w:t>ID</w:t>
             </w:r>
           </w:p>
@@ -3307,14 +3208,7 @@
                 <w:sz w:val="19"/>
                 <w:szCs w:val="19"/>
               </w:rPr>
-              <w:t xml:space="preserve">Certificate-tier recognition </w:t>
-            </w:r>
-            <w:r>
-              <w:rPr>
-                <w:sz w:val="19"/>
-                <w:szCs w:val="19"/>
-              </w:rPr>
-              <w:t>(Proficient, Advanced, Flawless)</w:t>
+              <w:t>Certificate-tier recognition (Proficient, Advanced, Flawless)</w:t>
             </w:r>
           </w:p>
         </w:tc>
@@ -3726,10 +3620,7 @@
       </w:pPr>
       <w:r>
         <w:lastRenderedPageBreak/>
-        <w:t>8</w:t>
-      </w:r>
-      <w:r>
-        <w:t>. Detailed Functional Requirements</w:t>
+        <w:t>8. Detailed Functional Requirements</w:t>
       </w:r>
     </w:p>
     <w:p>
@@ -3746,19 +3637,7 @@
         <w:spacing w:after="160" w:line="276" w:lineRule="auto"/>
       </w:pPr>
       <w:r>
-        <w:t>Every learning event the platform already records</w:t>
-      </w:r>
-      <w:r>
-        <w:t>,</w:t>
-      </w:r>
-      <w:r>
-        <w:t xml:space="preserve"> generates an XP award, logged individually so awards stay auditable and reversible if an event is later invalidated (e.g. an enro</w:t>
-      </w:r>
-      <w:r>
-        <w:t>l</w:t>
-      </w:r>
-      <w:r>
-        <w:t>lment is cancelled).</w:t>
+        <w:t>Every learning event the platform already records, generates an XP award, logged individually so awards stay auditable and reversible if an event is later invalidated (e.g. an enrollment is cancelled).</w:t>
       </w:r>
     </w:p>
     <w:tbl>
@@ -4085,7 +3964,7 @@
         <w:spacing w:after="160" w:line="276" w:lineRule="auto"/>
       </w:pPr>
       <w:r>
-        <w:t>A badge is a discrete, named recognition tied to a specific rule (full starter catalogue in Section 10). Badges are permanent once earned — a historical record, not a currency — and are stored against the learner with a reference back to the triggering event (e.g. the Certificate or CourseInstance) for traceability.</w:t>
+        <w:t>A badge is a discrete, named recognition tied to a specific rule (full starter catalogue in Section 9). Badges are permanent once earned — a historical record, not a currency — and are stored against the learner with a reference back to the triggering event (e.g. the Certificate or CourseInstance) for traceability.</w:t>
       </w:r>
     </w:p>
     <w:p>
@@ -4110,7 +3989,7 @@
         <w:spacing w:after="160" w:line="276" w:lineRule="auto"/>
       </w:pPr>
       <w:r>
-        <w:t>Ranks are a small, human-readable ladder (Novice → Apprentice → Practitioner → Specialist → Master) derived from cumulative XP thresholds (Section 11), recalculated whenever XP changes and shown as the headline stat on the Gamer Profile.</w:t>
+        <w:t>Ranks are a small, human-readable ladder (Novice → Apprentice → Practitioner → Specialist → Master) derived from cumulative XP thresholds (Section 10), recalculated whenever XP changes and shown as the headline stat on the Gamer Profile.</w:t>
       </w:r>
     </w:p>
     <w:p>
@@ -4144,7 +4023,7 @@
         <w:spacing w:after="160" w:line="276" w:lineRule="auto"/>
       </w:pPr>
       <w:r>
-        <w:t>Leaderboards are scoped, not global-only, to avoid the Killer-mechanic risk noted in Section 7:</w:t>
+        <w:t>Leaderboards are scoped, not global-only, to avoid the Killer-mechanic risk noted in Section 6:</w:t>
       </w:r>
     </w:p>
     <w:p>
@@ -4389,14 +4268,7 @@
                 <w:sz w:val="19"/>
                 <w:szCs w:val="19"/>
               </w:rPr>
-              <w:t>P</w:t>
-            </w:r>
-            <w:r>
-              <w:rPr>
-                <w:sz w:val="19"/>
-                <w:szCs w:val="19"/>
-              </w:rPr>
-              <w:t>roficient</w:t>
+              <w:t>Proficient</w:t>
             </w:r>
           </w:p>
         </w:tc>
@@ -4557,10 +4429,7 @@
         <w:spacing w:before="400"/>
       </w:pPr>
       <w:r>
-        <w:t>9</w:t>
-      </w:r>
-      <w:r>
-        <w:t>. Proposed Badge Catalogue (Starter Set)</w:t>
+        <w:t>9. Proposed Badge Catalogue (Starter Set)</w:t>
       </w:r>
     </w:p>
     <w:p>
@@ -5480,13 +5349,7 @@
         <w:spacing w:before="400"/>
       </w:pPr>
       <w:r>
-        <w:t>1</w:t>
-      </w:r>
-      <w:r>
-        <w:t>0</w:t>
-      </w:r>
-      <w:r>
-        <w:t>. Proposed Rank Ladder</w:t>
+        <w:t>10. Proposed Rank Ladder</w:t>
       </w:r>
     </w:p>
     <w:p>
@@ -5938,13 +5801,513 @@
         <w:spacing w:before="400"/>
       </w:pPr>
       <w:r>
-        <w:t>1</w:t>
-      </w:r>
-      <w:r>
-        <w:t>1</w:t>
-      </w:r>
-      <w:r>
-        <w:t>. Data &amp; Integration Approach (Non-Invasive Extension)</w:t>
+        <w:t>11. Class System &amp; Simulated Challenges (Concept Extension)</w:t>
+      </w:r>
+    </w:p>
+    <w:p>
+      <w:pPr>
+        <w:spacing w:after="160" w:line="276" w:lineRule="auto"/>
+      </w:pPr>
+      <w:r>
+        <w:t>An additional idea was raised during review: layer learner “classes” and lightweight simulated challenges on top of the rank system, so progress feels like an RPG-style journey rather than a flat leaderboard. This is a strong Achiever/Killer/Socializer hook and is documented below as a proposed extension, kept separate from Phases 1–3 because it raises two open questions the rest of this BRD deliberately avoided: brand fit (does a “battle” framing suit a professional B2B training platform?) and cross-category fairness (comparing a learner in a 4-lesson seminar against one in a 40-lesson program). Both are called out below as decisions to make before build, not blockers to the idea itself.</w:t>
+      </w:r>
+    </w:p>
+    <w:p>
+      <w:pPr>
+        <w:pStyle w:val="heading20"/>
+        <w:spacing w:before="300" w:after="150"/>
+      </w:pPr>
+      <w:r>
+        <w:t>FR-11 — Learner Classes</w:t>
+      </w:r>
+    </w:p>
+    <w:p>
+      <w:pPr>
+        <w:spacing w:after="160" w:line="276" w:lineRule="auto"/>
+      </w:pPr>
+      <w:r>
+        <w:t xml:space="preserve">A learner's Rank (Section 10) is given a thematic “class” skin derived from the Course.category they engage with most — for example, a learner concentrated in JavaScript courses could rank up as a “Warrior,” one focused on data/analytics as an “Architect.” This is a presentation layer only: it reuses the same XP/rank thresholds already </w:t>
+      </w:r>
+      <w:r>
+        <w:lastRenderedPageBreak/>
+        <w:t>defined in Section 10 and does not change how XP or rank is calculated. A learner active across several categories keeps their dominant class but can unlock a secondary class once a threshold of activity in another category is reached — a direct hook for Explorers who branch out on purpose.</w:t>
+      </w:r>
+    </w:p>
+    <w:tbl>
+      <w:tblPr>
+        <w:tblW w:w="5000" w:type="pct"/>
+        <w:tblInd w:w="-3" w:type="dxa"/>
+        <w:tblBorders>
+          <w:top w:val="single" w:sz="4" w:space="0" w:color="CCCCCC"/>
+          <w:left w:val="single" w:sz="4" w:space="0" w:color="CCCCCC"/>
+          <w:bottom w:val="single" w:sz="4" w:space="0" w:color="CCCCCC"/>
+          <w:right w:val="single" w:sz="4" w:space="0" w:color="CCCCCC"/>
+          <w:insideH w:val="single" w:sz="4" w:space="0" w:color="CCCCCC"/>
+          <w:insideV w:val="single" w:sz="4" w:space="0" w:color="CCCCCC"/>
+        </w:tblBorders>
+        <w:tblCellMar>
+          <w:left w:w="10" w:type="dxa"/>
+          <w:right w:w="10" w:type="dxa"/>
+        </w:tblCellMar>
+        <w:tblLook w:val="04A0" w:firstRow="1" w:lastRow="0" w:firstColumn="1" w:lastColumn="0" w:noHBand="0" w:noVBand="1"/>
+      </w:tblPr>
+      <w:tblGrid>
+        <w:gridCol w:w="4089"/>
+        <w:gridCol w:w="2921"/>
+        <w:gridCol w:w="2726"/>
+      </w:tblGrid>
+      <w:tr>
+        <w:trPr>
+          <w:tblHeader/>
+        </w:trPr>
+        <w:tc>
+          <w:tcPr>
+            <w:tcW w:w="2100" w:type="pct"/>
+            <w:shd w:val="clear" w:color="auto" w:fill="1F2A44"/>
+            <w:tcMar>
+              <w:top w:w="100" w:type="dxa"/>
+              <w:left w:w="120" w:type="dxa"/>
+              <w:bottom w:w="100" w:type="dxa"/>
+              <w:right w:w="120" w:type="dxa"/>
+            </w:tcMar>
+            <w:vAlign w:val="center"/>
+          </w:tcPr>
+          <w:p>
+            <w:r>
+              <w:rPr>
+                <w:b/>
+                <w:bCs/>
+                <w:color w:val="FFFFFF"/>
+                <w:sz w:val="19"/>
+                <w:szCs w:val="19"/>
+              </w:rPr>
+              <w:t>Course Category (Course.category)</w:t>
+            </w:r>
+          </w:p>
+        </w:tc>
+        <w:tc>
+          <w:tcPr>
+            <w:tcW w:w="1500" w:type="pct"/>
+            <w:shd w:val="clear" w:color="auto" w:fill="1F2A44"/>
+            <w:tcMar>
+              <w:top w:w="100" w:type="dxa"/>
+              <w:left w:w="120" w:type="dxa"/>
+              <w:bottom w:w="100" w:type="dxa"/>
+              <w:right w:w="120" w:type="dxa"/>
+            </w:tcMar>
+            <w:vAlign w:val="center"/>
+          </w:tcPr>
+          <w:p>
+            <w:r>
+              <w:rPr>
+                <w:b/>
+                <w:bCs/>
+                <w:color w:val="FFFFFF"/>
+                <w:sz w:val="19"/>
+                <w:szCs w:val="19"/>
+              </w:rPr>
+              <w:t>Class (EN)</w:t>
+            </w:r>
+          </w:p>
+        </w:tc>
+        <w:tc>
+          <w:tcPr>
+            <w:tcW w:w="1400" w:type="pct"/>
+            <w:shd w:val="clear" w:color="auto" w:fill="1F2A44"/>
+            <w:tcMar>
+              <w:top w:w="100" w:type="dxa"/>
+              <w:left w:w="120" w:type="dxa"/>
+              <w:bottom w:w="100" w:type="dxa"/>
+              <w:right w:w="120" w:type="dxa"/>
+            </w:tcMar>
+            <w:vAlign w:val="center"/>
+          </w:tcPr>
+          <w:p>
+            <w:r>
+              <w:rPr>
+                <w:b/>
+                <w:bCs/>
+                <w:color w:val="FFFFFF"/>
+                <w:sz w:val="19"/>
+                <w:szCs w:val="19"/>
+              </w:rPr>
+              <w:t>Bartle Fit</w:t>
+            </w:r>
+          </w:p>
+        </w:tc>
+      </w:tr>
+      <w:tr>
+        <w:tc>
+          <w:tcPr>
+            <w:tcW w:w="2100" w:type="pct"/>
+            <w:tcMar>
+              <w:top w:w="100" w:type="dxa"/>
+              <w:left w:w="120" w:type="dxa"/>
+              <w:bottom w:w="100" w:type="dxa"/>
+              <w:right w:w="120" w:type="dxa"/>
+            </w:tcMar>
+            <w:vAlign w:val="center"/>
+          </w:tcPr>
+          <w:p>
+            <w:r>
+              <w:rPr>
+                <w:sz w:val="19"/>
+                <w:szCs w:val="19"/>
+              </w:rPr>
+              <w:t>JavaScript / Frontend</w:t>
+            </w:r>
+          </w:p>
+        </w:tc>
+        <w:tc>
+          <w:tcPr>
+            <w:tcW w:w="1500" w:type="pct"/>
+            <w:tcMar>
+              <w:top w:w="100" w:type="dxa"/>
+              <w:left w:w="120" w:type="dxa"/>
+              <w:bottom w:w="100" w:type="dxa"/>
+              <w:right w:w="120" w:type="dxa"/>
+            </w:tcMar>
+            <w:vAlign w:val="center"/>
+          </w:tcPr>
+          <w:p>
+            <w:r>
+              <w:rPr>
+                <w:sz w:val="19"/>
+                <w:szCs w:val="19"/>
+              </w:rPr>
+              <w:t>Warrior</w:t>
+            </w:r>
+          </w:p>
+        </w:tc>
+        <w:tc>
+          <w:tcPr>
+            <w:tcW w:w="1400" w:type="pct"/>
+            <w:tcMar>
+              <w:top w:w="100" w:type="dxa"/>
+              <w:left w:w="120" w:type="dxa"/>
+              <w:bottom w:w="100" w:type="dxa"/>
+              <w:right w:w="120" w:type="dxa"/>
+            </w:tcMar>
+            <w:vAlign w:val="center"/>
+          </w:tcPr>
+          <w:p>
+            <w:r>
+              <w:rPr>
+                <w:sz w:val="19"/>
+                <w:szCs w:val="19"/>
+              </w:rPr>
+              <w:t>Achiever, Killer</w:t>
+            </w:r>
+          </w:p>
+        </w:tc>
+      </w:tr>
+      <w:tr>
+        <w:tc>
+          <w:tcPr>
+            <w:tcW w:w="2100" w:type="pct"/>
+            <w:shd w:val="clear" w:color="auto" w:fill="F7F7F5"/>
+            <w:tcMar>
+              <w:top w:w="100" w:type="dxa"/>
+              <w:left w:w="120" w:type="dxa"/>
+              <w:bottom w:w="100" w:type="dxa"/>
+              <w:right w:w="120" w:type="dxa"/>
+            </w:tcMar>
+            <w:vAlign w:val="center"/>
+          </w:tcPr>
+          <w:p>
+            <w:r>
+              <w:rPr>
+                <w:sz w:val="19"/>
+                <w:szCs w:val="19"/>
+              </w:rPr>
+              <w:t>Data &amp; Analytics</w:t>
+            </w:r>
+          </w:p>
+        </w:tc>
+        <w:tc>
+          <w:tcPr>
+            <w:tcW w:w="1500" w:type="pct"/>
+            <w:shd w:val="clear" w:color="auto" w:fill="F7F7F5"/>
+            <w:tcMar>
+              <w:top w:w="100" w:type="dxa"/>
+              <w:left w:w="120" w:type="dxa"/>
+              <w:bottom w:w="100" w:type="dxa"/>
+              <w:right w:w="120" w:type="dxa"/>
+            </w:tcMar>
+            <w:vAlign w:val="center"/>
+          </w:tcPr>
+          <w:p>
+            <w:r>
+              <w:rPr>
+                <w:sz w:val="19"/>
+                <w:szCs w:val="19"/>
+              </w:rPr>
+              <w:t>Architect</w:t>
+            </w:r>
+          </w:p>
+        </w:tc>
+        <w:tc>
+          <w:tcPr>
+            <w:tcW w:w="1400" w:type="pct"/>
+            <w:shd w:val="clear" w:color="auto" w:fill="F7F7F5"/>
+            <w:tcMar>
+              <w:top w:w="100" w:type="dxa"/>
+              <w:left w:w="120" w:type="dxa"/>
+              <w:bottom w:w="100" w:type="dxa"/>
+              <w:right w:w="120" w:type="dxa"/>
+            </w:tcMar>
+            <w:vAlign w:val="center"/>
+          </w:tcPr>
+          <w:p>
+            <w:r>
+              <w:rPr>
+                <w:sz w:val="19"/>
+                <w:szCs w:val="19"/>
+              </w:rPr>
+              <w:t>Achiever, Explorer</w:t>
+            </w:r>
+          </w:p>
+        </w:tc>
+      </w:tr>
+      <w:tr>
+        <w:tc>
+          <w:tcPr>
+            <w:tcW w:w="2100" w:type="pct"/>
+            <w:tcMar>
+              <w:top w:w="100" w:type="dxa"/>
+              <w:left w:w="120" w:type="dxa"/>
+              <w:bottom w:w="100" w:type="dxa"/>
+              <w:right w:w="120" w:type="dxa"/>
+            </w:tcMar>
+            <w:vAlign w:val="center"/>
+          </w:tcPr>
+          <w:p>
+            <w:r>
+              <w:rPr>
+                <w:sz w:val="19"/>
+                <w:szCs w:val="19"/>
+              </w:rPr>
+              <w:t>Design / UX</w:t>
+            </w:r>
+          </w:p>
+        </w:tc>
+        <w:tc>
+          <w:tcPr>
+            <w:tcW w:w="1500" w:type="pct"/>
+            <w:tcMar>
+              <w:top w:w="100" w:type="dxa"/>
+              <w:left w:w="120" w:type="dxa"/>
+              <w:bottom w:w="100" w:type="dxa"/>
+              <w:right w:w="120" w:type="dxa"/>
+            </w:tcMar>
+            <w:vAlign w:val="center"/>
+          </w:tcPr>
+          <w:p>
+            <w:r>
+              <w:rPr>
+                <w:sz w:val="19"/>
+                <w:szCs w:val="19"/>
+              </w:rPr>
+              <w:t>Artificer</w:t>
+            </w:r>
+          </w:p>
+        </w:tc>
+        <w:tc>
+          <w:tcPr>
+            <w:tcW w:w="1400" w:type="pct"/>
+            <w:tcMar>
+              <w:top w:w="100" w:type="dxa"/>
+              <w:left w:w="120" w:type="dxa"/>
+              <w:bottom w:w="100" w:type="dxa"/>
+              <w:right w:w="120" w:type="dxa"/>
+            </w:tcMar>
+            <w:vAlign w:val="center"/>
+          </w:tcPr>
+          <w:p>
+            <w:r>
+              <w:rPr>
+                <w:sz w:val="19"/>
+                <w:szCs w:val="19"/>
+              </w:rPr>
+              <w:t>Explorer</w:t>
+            </w:r>
+          </w:p>
+        </w:tc>
+      </w:tr>
+      <w:tr>
+        <w:tc>
+          <w:tcPr>
+            <w:tcW w:w="2100" w:type="pct"/>
+            <w:shd w:val="clear" w:color="auto" w:fill="F7F7F5"/>
+            <w:tcMar>
+              <w:top w:w="100" w:type="dxa"/>
+              <w:left w:w="120" w:type="dxa"/>
+              <w:bottom w:w="100" w:type="dxa"/>
+              <w:right w:w="120" w:type="dxa"/>
+            </w:tcMar>
+            <w:vAlign w:val="center"/>
+          </w:tcPr>
+          <w:p>
+            <w:r>
+              <w:rPr>
+                <w:sz w:val="19"/>
+                <w:szCs w:val="19"/>
+              </w:rPr>
+              <w:t>Business / Soft Skills</w:t>
+            </w:r>
+          </w:p>
+        </w:tc>
+        <w:tc>
+          <w:tcPr>
+            <w:tcW w:w="1500" w:type="pct"/>
+            <w:shd w:val="clear" w:color="auto" w:fill="F7F7F5"/>
+            <w:tcMar>
+              <w:top w:w="100" w:type="dxa"/>
+              <w:left w:w="120" w:type="dxa"/>
+              <w:bottom w:w="100" w:type="dxa"/>
+              <w:right w:w="120" w:type="dxa"/>
+            </w:tcMar>
+            <w:vAlign w:val="center"/>
+          </w:tcPr>
+          <w:p>
+            <w:r>
+              <w:rPr>
+                <w:sz w:val="19"/>
+                <w:szCs w:val="19"/>
+              </w:rPr>
+              <w:t>Strategist</w:t>
+            </w:r>
+          </w:p>
+        </w:tc>
+        <w:tc>
+          <w:tcPr>
+            <w:tcW w:w="1400" w:type="pct"/>
+            <w:shd w:val="clear" w:color="auto" w:fill="F7F7F5"/>
+            <w:tcMar>
+              <w:top w:w="100" w:type="dxa"/>
+              <w:left w:w="120" w:type="dxa"/>
+              <w:bottom w:w="100" w:type="dxa"/>
+              <w:right w:w="120" w:type="dxa"/>
+            </w:tcMar>
+            <w:vAlign w:val="center"/>
+          </w:tcPr>
+          <w:p>
+            <w:r>
+              <w:rPr>
+                <w:sz w:val="19"/>
+                <w:szCs w:val="19"/>
+              </w:rPr>
+              <w:t>Achiever, Socializer</w:t>
+            </w:r>
+          </w:p>
+        </w:tc>
+      </w:tr>
+      <w:tr>
+        <w:tc>
+          <w:tcPr>
+            <w:tcW w:w="2100" w:type="pct"/>
+            <w:tcMar>
+              <w:top w:w="100" w:type="dxa"/>
+              <w:left w:w="120" w:type="dxa"/>
+              <w:bottom w:w="100" w:type="dxa"/>
+              <w:right w:w="120" w:type="dxa"/>
+            </w:tcMar>
+            <w:vAlign w:val="center"/>
+          </w:tcPr>
+          <w:p>
+            <w:r>
+              <w:rPr>
+                <w:sz w:val="19"/>
+                <w:szCs w:val="19"/>
+              </w:rPr>
+              <w:t>Mixed / no dominant category</w:t>
+            </w:r>
+          </w:p>
+        </w:tc>
+        <w:tc>
+          <w:tcPr>
+            <w:tcW w:w="1500" w:type="pct"/>
+            <w:tcMar>
+              <w:top w:w="100" w:type="dxa"/>
+              <w:left w:w="120" w:type="dxa"/>
+              <w:bottom w:w="100" w:type="dxa"/>
+              <w:right w:w="120" w:type="dxa"/>
+            </w:tcMar>
+            <w:vAlign w:val="center"/>
+          </w:tcPr>
+          <w:p>
+            <w:r>
+              <w:rPr>
+                <w:sz w:val="19"/>
+                <w:szCs w:val="19"/>
+              </w:rPr>
+              <w:t>Adventurer</w:t>
+            </w:r>
+          </w:p>
+        </w:tc>
+        <w:tc>
+          <w:tcPr>
+            <w:tcW w:w="1400" w:type="pct"/>
+            <w:tcMar>
+              <w:top w:w="100" w:type="dxa"/>
+              <w:left w:w="120" w:type="dxa"/>
+              <w:bottom w:w="100" w:type="dxa"/>
+              <w:right w:w="120" w:type="dxa"/>
+            </w:tcMar>
+            <w:vAlign w:val="center"/>
+          </w:tcPr>
+          <w:p>
+            <w:r>
+              <w:rPr>
+                <w:sz w:val="19"/>
+                <w:szCs w:val="19"/>
+              </w:rPr>
+              <w:t>Explorer</w:t>
+            </w:r>
+          </w:p>
+        </w:tc>
+      </w:tr>
+    </w:tbl>
+    <w:p>
+      <w:pPr>
+        <w:spacing w:after="160" w:line="276" w:lineRule="auto"/>
+      </w:pPr>
+      <w:r>
+        <w:t>Class names and Bulgarian equivalents above are illustrative placeholders — see the open decisions below before treating them as final.</w:t>
+      </w:r>
+    </w:p>
+    <w:p>
+      <w:pPr>
+        <w:pStyle w:val="heading20"/>
+        <w:spacing w:before="300" w:after="150"/>
+      </w:pPr>
+      <w:r>
+        <w:t>FR-12 — Simulated Challenges (“Battles”)</w:t>
+      </w:r>
+    </w:p>
+    <w:p>
+      <w:pPr>
+        <w:spacing w:after="160" w:line="276" w:lineRule="auto"/>
+      </w:pPr>
+      <w:r>
+        <w:t>A lightweight, asynchronous challenge: a learner can challenge another learner (or an unclaimed practice target, for solo play) to a stat comparison. Current XP, active streak, and most recent certificate score combine into a single challenge score and are narrated as a short win/lose outcome (e.g. “Warrior vs. Architect — decided by a stronger 7-day streak”). This is explicitly not a live, real-time, or skill-based game: no new gameplay engine, no knowledge-testing content, and no real-time infrastructure are required — it is a narrative wrapper over data the platform already produces via FR-1 through FR-4. Challenges are opt-in and scoped to a learner's own cohort or Program by default, reusing the same exclusion logic as leaderboards (FR-5), and a loss never removes XP, badges, or rank — only a small cosmetic “win streak” counter is at stake, so the mechanic adds competitive fun without the downside risk flagged for leaderboards in Section 6.</w:t>
+      </w:r>
+    </w:p>
+    <w:p>
+      <w:pPr>
+        <w:spacing w:after="160" w:line="276" w:lineRule="auto"/>
+      </w:pPr>
+      <w:r>
+        <w:t>Acceptance criteria: Given two learners with private: false both opt in to a challenge, when the challenge is resolved, then a ChallengeLog entry records both users' snapshot stats and the outcome, and neither learner's underlying XP, rank, or badges are modified as a result.</w:t>
+      </w:r>
+    </w:p>
+    <w:p>
+      <w:pPr>
+        <w:pStyle w:val="heading10"/>
+        <w:spacing w:before="400"/>
+      </w:pPr>
+      <w:r>
+        <w:t>12. Data &amp; Integration Approach (Non-Invasive Extension)</w:t>
       </w:r>
     </w:p>
     <w:p>
@@ -6209,7 +6572,6 @@
                 <w:sz w:val="19"/>
                 <w:szCs w:val="19"/>
               </w:rPr>
-              <w:lastRenderedPageBreak/>
               <w:t>Badge</w:t>
             </w:r>
           </w:p>
@@ -6276,6 +6638,7 @@
                 <w:sz w:val="19"/>
                 <w:szCs w:val="19"/>
               </w:rPr>
+              <w:lastRenderedPageBreak/>
               <w:t>BadgeAward</w:t>
             </w:r>
           </w:p>
@@ -6390,6 +6753,136 @@
           </w:p>
         </w:tc>
       </w:tr>
+      <w:tr>
+        <w:tc>
+          <w:tcPr>
+            <w:tcW w:w="1200" w:type="pct"/>
+            <w:tcMar>
+              <w:top w:w="100" w:type="dxa"/>
+              <w:left w:w="120" w:type="dxa"/>
+              <w:bottom w:w="100" w:type="dxa"/>
+              <w:right w:w="120" w:type="dxa"/>
+            </w:tcMar>
+            <w:vAlign w:val="center"/>
+          </w:tcPr>
+          <w:p>
+            <w:r>
+              <w:rPr>
+                <w:sz w:val="19"/>
+                <w:szCs w:val="19"/>
+              </w:rPr>
+              <w:t>Class</w:t>
+            </w:r>
+          </w:p>
+        </w:tc>
+        <w:tc>
+          <w:tcPr>
+            <w:tcW w:w="2100" w:type="pct"/>
+            <w:tcMar>
+              <w:top w:w="100" w:type="dxa"/>
+              <w:left w:w="120" w:type="dxa"/>
+              <w:bottom w:w="100" w:type="dxa"/>
+              <w:right w:w="120" w:type="dxa"/>
+            </w:tcMar>
+            <w:vAlign w:val="center"/>
+          </w:tcPr>
+          <w:p>
+            <w:r>
+              <w:rPr>
+                <w:sz w:val="19"/>
+                <w:szCs w:val="19"/>
+              </w:rPr>
+              <w:t>Static catalogue of class definitions (name/nameBg, source category, icon) — see Section 11</w:t>
+            </w:r>
+          </w:p>
+        </w:tc>
+        <w:tc>
+          <w:tcPr>
+            <w:tcW w:w="1700" w:type="pct"/>
+            <w:tcMar>
+              <w:top w:w="100" w:type="dxa"/>
+              <w:left w:w="120" w:type="dxa"/>
+              <w:bottom w:w="100" w:type="dxa"/>
+              <w:right w:w="120" w:type="dxa"/>
+            </w:tcMar>
+            <w:vAlign w:val="center"/>
+          </w:tcPr>
+          <w:p>
+            <w:r>
+              <w:rPr>
+                <w:sz w:val="19"/>
+                <w:szCs w:val="19"/>
+              </w:rPr>
+              <w:t>No dependency</w:t>
+            </w:r>
+          </w:p>
+        </w:tc>
+      </w:tr>
+      <w:tr>
+        <w:tc>
+          <w:tcPr>
+            <w:tcW w:w="1200" w:type="pct"/>
+            <w:tcMar>
+              <w:top w:w="100" w:type="dxa"/>
+              <w:left w:w="120" w:type="dxa"/>
+              <w:bottom w:w="100" w:type="dxa"/>
+              <w:right w:w="120" w:type="dxa"/>
+            </w:tcMar>
+            <w:vAlign w:val="center"/>
+          </w:tcPr>
+          <w:p>
+            <w:r>
+              <w:rPr>
+                <w:sz w:val="19"/>
+                <w:szCs w:val="19"/>
+              </w:rPr>
+              <w:t>ChallengeLog</w:t>
+            </w:r>
+          </w:p>
+        </w:tc>
+        <w:tc>
+          <w:tcPr>
+            <w:tcW w:w="2100" w:type="pct"/>
+            <w:tcMar>
+              <w:top w:w="100" w:type="dxa"/>
+              <w:left w:w="120" w:type="dxa"/>
+              <w:bottom w:w="100" w:type="dxa"/>
+              <w:right w:w="120" w:type="dxa"/>
+            </w:tcMar>
+            <w:vAlign w:val="center"/>
+          </w:tcPr>
+          <w:p>
+            <w:r>
+              <w:rPr>
+                <w:sz w:val="19"/>
+                <w:szCs w:val="19"/>
+              </w:rPr>
+              <w:t>Records each simulated challenge: both users' snapshot stats at challenge time and the outcome (Section 11)</w:t>
+            </w:r>
+          </w:p>
+        </w:tc>
+        <w:tc>
+          <w:tcPr>
+            <w:tcW w:w="1700" w:type="pct"/>
+            <w:tcMar>
+              <w:top w:w="100" w:type="dxa"/>
+              <w:left w:w="120" w:type="dxa"/>
+              <w:bottom w:w="100" w:type="dxa"/>
+              <w:right w:w="120" w:type="dxa"/>
+            </w:tcMar>
+            <w:vAlign w:val="center"/>
+          </w:tcPr>
+          <w:p>
+            <w:r>
+              <w:rPr>
+                <w:sz w:val="19"/>
+                <w:szCs w:val="19"/>
+              </w:rPr>
+              <w:t>User._id (x2), GamificationProfile, Certificate._id (optional)</w:t>
+            </w:r>
+          </w:p>
+        </w:tc>
+      </w:tr>
     </w:tbl>
     <w:p>
       <w:pPr>
@@ -6404,20 +6897,8 @@
         <w:pStyle w:val="heading10"/>
         <w:spacing w:before="400"/>
       </w:pPr>
-    </w:p>
-    <w:p>
-      <w:pPr>
-        <w:pStyle w:val="heading10"/>
-        <w:spacing w:before="400"/>
-      </w:pPr>
-      <w:r>
-        <w:t>1</w:t>
-      </w:r>
-      <w:r>
-        <w:t>2</w:t>
-      </w:r>
-      <w:r>
-        <w:t>. Risks &amp; Mitigations</w:t>
+      <w:r>
+        <w:t>13. Risks &amp; Mitigations</w:t>
       </w:r>
     </w:p>
     <w:tbl>
@@ -6721,6 +7202,50 @@
           </w:p>
         </w:tc>
       </w:tr>
+      <w:tr>
+        <w:tc>
+          <w:tcPr>
+            <w:tcW w:w="2250" w:type="pct"/>
+            <w:tcMar>
+              <w:top w:w="100" w:type="dxa"/>
+              <w:left w:w="120" w:type="dxa"/>
+              <w:bottom w:w="100" w:type="dxa"/>
+              <w:right w:w="120" w:type="dxa"/>
+            </w:tcMar>
+            <w:vAlign w:val="center"/>
+          </w:tcPr>
+          <w:p>
+            <w:r>
+              <w:rPr>
+                <w:sz w:val="19"/>
+                <w:szCs w:val="19"/>
+              </w:rPr>
+              <w:t>"Class"/"battle" framing (Section 11) feels off-brand for a professional B2B academy, or one class reads as more prestigious than another</w:t>
+            </w:r>
+          </w:p>
+        </w:tc>
+        <w:tc>
+          <w:tcPr>
+            <w:tcW w:w="2750" w:type="pct"/>
+            <w:tcMar>
+              <w:top w:w="100" w:type="dxa"/>
+              <w:left w:w="120" w:type="dxa"/>
+              <w:bottom w:w="100" w:type="dxa"/>
+              <w:right w:w="120" w:type="dxa"/>
+            </w:tcMar>
+            <w:vAlign w:val="center"/>
+          </w:tcPr>
+          <w:p>
+            <w:r>
+              <w:rPr>
+                <w:sz w:val="19"/>
+                <w:szCs w:val="19"/>
+              </w:rPr>
+              <w:t>Validate terminology and class parity with Marketing/Academy before any build; keep the feature in backlog (Phase 4) until confirmed</w:t>
+            </w:r>
+          </w:p>
+        </w:tc>
+      </w:tr>
     </w:tbl>
     <w:p>
       <w:pPr>
@@ -6728,13 +7253,7 @@
         <w:spacing w:before="400"/>
       </w:pPr>
       <w:r>
-        <w:t>1</w:t>
-      </w:r>
-      <w:r>
-        <w:t>3</w:t>
-      </w:r>
-      <w:r>
-        <w:t>. Phased Rollout Plan</w:t>
+        <w:t>14. Phased Rollout Plan</w:t>
       </w:r>
     </w:p>
     <w:tbl>
@@ -6991,6 +7510,7 @@
                 <w:sz w:val="19"/>
                 <w:szCs w:val="19"/>
               </w:rPr>
+              <w:lastRenderedPageBreak/>
               <w:t>Phase 3</w:t>
             </w:r>
           </w:p>
@@ -7034,6 +7554,71 @@
                 <w:szCs w:val="19"/>
               </w:rPr>
               <w:t>Adds Socializer/Killer mechanics last, once privacy exclusion and cohort scoping can be properly tested against real usage data from Phases 1–2</w:t>
+            </w:r>
+          </w:p>
+        </w:tc>
+      </w:tr>
+      <w:tr>
+        <w:tc>
+          <w:tcPr>
+            <w:tcW w:w="750" w:type="pct"/>
+            <w:tcMar>
+              <w:top w:w="100" w:type="dxa"/>
+              <w:left w:w="120" w:type="dxa"/>
+              <w:bottom w:w="100" w:type="dxa"/>
+              <w:right w:w="120" w:type="dxa"/>
+            </w:tcMar>
+            <w:vAlign w:val="center"/>
+          </w:tcPr>
+          <w:p>
+            <w:r>
+              <w:rPr>
+                <w:sz w:val="19"/>
+                <w:szCs w:val="19"/>
+              </w:rPr>
+              <w:t>Phase 4</w:t>
+            </w:r>
+          </w:p>
+        </w:tc>
+        <w:tc>
+          <w:tcPr>
+            <w:tcW w:w="2250" w:type="pct"/>
+            <w:tcMar>
+              <w:top w:w="100" w:type="dxa"/>
+              <w:left w:w="120" w:type="dxa"/>
+              <w:bottom w:w="100" w:type="dxa"/>
+              <w:right w:w="120" w:type="dxa"/>
+            </w:tcMar>
+            <w:vAlign w:val="center"/>
+          </w:tcPr>
+          <w:p>
+            <w:r>
+              <w:rPr>
+                <w:sz w:val="19"/>
+                <w:szCs w:val="19"/>
+              </w:rPr>
+              <w:t>FR-11 (Learner Classes), FR-12 (Simulated Challenges) — concept/backlog</w:t>
+            </w:r>
+          </w:p>
+        </w:tc>
+        <w:tc>
+          <w:tcPr>
+            <w:tcW w:w="2000" w:type="pct"/>
+            <w:tcMar>
+              <w:top w:w="100" w:type="dxa"/>
+              <w:left w:w="120" w:type="dxa"/>
+              <w:bottom w:w="100" w:type="dxa"/>
+              <w:right w:w="120" w:type="dxa"/>
+            </w:tcMar>
+            <w:vAlign w:val="center"/>
+          </w:tcPr>
+          <w:p>
+            <w:r>
+              <w:rPr>
+                <w:sz w:val="19"/>
+                <w:szCs w:val="19"/>
+              </w:rPr>
+              <w:t>Held back deliberately: needs Marketing/Academy sign-off on tone and a fairness model, validated against real Phase 1–3 usage data first</w:t>
             </w:r>
           </w:p>
         </w:tc>
@@ -7045,14 +7630,7 @@
         <w:spacing w:before="400"/>
       </w:pPr>
       <w:r>
-        <w:lastRenderedPageBreak/>
-        <w:t>1</w:t>
-      </w:r>
-      <w:r>
-        <w:t>4</w:t>
-      </w:r>
-      <w:r>
-        <w:t>. Sample Acceptance Criteria (Given / When / Then)</w:t>
+        <w:t>15. Sample Acceptance Criteria (Given / When / Then)</w:t>
       </w:r>
     </w:p>
     <w:p>
@@ -7078,7 +7656,7 @@
         <w:spacing w:after="80"/>
       </w:pPr>
       <w:r>
-        <w:t>Given a Certificate is created with score = 96, when the badge engine runs, then a "Distinguished Graduate" and "Perfectionist"-adjacent tier badge (per the thresholds in Section 9, FR-7) is recorded in BadgeAward exactly once.</w:t>
+        <w:t>Given a Certificate is created with score = 96, when the badge engine runs, then a "Distinguished Graduate" and "Perfectionist"-adjacent tier badge (per the thresholds in Section 8, FR-7) is recorded in BadgeAward exactly once.</w:t>
       </w:r>
     </w:p>
     <w:p>
@@ -7105,6 +7683,19 @@
       </w:pPr>
       <w:r>
         <w:t>Given Program.calculateProgress() returns 100 for a learner, when the gamification hook evaluates Program milestones, then a completion badge and the corresponding XP bonus are awarded exactly once, with no duplicate award on subsequent recalculation.</w:t>
+      </w:r>
+    </w:p>
+    <w:p>
+      <w:pPr>
+        <w:pStyle w:val="ListParagraph"/>
+        <w:numPr>
+          <w:ilvl w:val="0"/>
+          <w:numId w:val="2"/>
+        </w:numPr>
+        <w:spacing w:after="80"/>
+      </w:pPr>
+      <w:r>
+        <w:t>Given two learners both opt in to a simulated challenge (Section 11, FR-12), when the challenge resolves, then a ChallengeLog entry is written with both snapshot stats and the outcome, and neither learner’s XP, rank, or badges change as a result.</w:t>
       </w:r>
     </w:p>
     <w:sectPr>

</xml_diff>